<commit_message>
Updated Ecosampler documentation to reviewer feedback Removed all uses of Sourcegrid.Selection.GetCells; was way too heavy Sourgrid SelectionChanged event no longer distributes selected cells collection
git-svn-id: https://sources.ecopath.org/svn/Ecopath/trunk/Ecopath6@15325 a725721c-0ed6-864e-a6a8-02c2a1988c9d
</commit_message>
<xml_diff>
--- a/Sources/EwECustomPlugins/EwEEcoSamplerPlugin/Documentation/EcoSampler.docx
+++ b/Sources/EwECustomPlugins/EwEEcoSamplerPlugin/Documentation/EcoSampler.docx
@@ -1,6 +1,6 @@
 
 <file path=word/document.xml><?xml version="1.0" encoding="utf-8"?>
-<w:document xmlns:wpc="http://schemas.microsoft.com/office/word/2010/wordprocessingCanvas" xmlns:cx="http://schemas.microsoft.com/office/drawing/2014/chartex" xmlns:cx1="http://schemas.microsoft.com/office/drawing/2015/9/8/chartex" xmlns:mc="http://schemas.openxmlformats.org/markup-compatibility/2006" xmlns:o="urn:schemas-microsoft-com:office:office" xmlns:r="http://schemas.openxmlformats.org/officeDocument/2006/relationships" xmlns:m="http://schemas.openxmlformats.org/officeDocument/2006/math" xmlns:v="urn:schemas-microsoft-com:vml" xmlns:wp14="http://schemas.microsoft.com/office/word/2010/wordprocessingDrawing" xmlns:wp="http://schemas.openxmlformats.org/drawingml/2006/wordprocessingDrawing" xmlns:w10="urn:schemas-microsoft-com:office:word" xmlns:w="http://schemas.openxmlformats.org/wordprocessingml/2006/main" xmlns:w14="http://schemas.microsoft.com/office/word/2010/wordml" xmlns:w15="http://schemas.microsoft.com/office/word/2012/wordml" xmlns:w16se="http://schemas.microsoft.com/office/word/2015/wordml/symex" xmlns:wpg="http://schemas.microsoft.com/office/word/2010/wordprocessingGroup" xmlns:wpi="http://schemas.microsoft.com/office/word/2010/wordprocessingInk" xmlns:wne="http://schemas.microsoft.com/office/word/2006/wordml" xmlns:wps="http://schemas.microsoft.com/office/word/2010/wordprocessingShape" mc:Ignorable="w14 w15 w16se wp14">
+<w:document xmlns:wpc="http://schemas.microsoft.com/office/word/2010/wordprocessingCanvas" xmlns:cx="http://schemas.microsoft.com/office/drawing/2014/chartex" xmlns:mc="http://schemas.openxmlformats.org/markup-compatibility/2006" xmlns:o="urn:schemas-microsoft-com:office:office" xmlns:r="http://schemas.openxmlformats.org/officeDocument/2006/relationships" xmlns:m="http://schemas.openxmlformats.org/officeDocument/2006/math" xmlns:v="urn:schemas-microsoft-com:vml" xmlns:wp14="http://schemas.microsoft.com/office/word/2010/wordprocessingDrawing" xmlns:wp="http://schemas.openxmlformats.org/drawingml/2006/wordprocessingDrawing" xmlns:w10="urn:schemas-microsoft-com:office:word" xmlns:w="http://schemas.openxmlformats.org/wordprocessingml/2006/main" xmlns:w14="http://schemas.microsoft.com/office/word/2010/wordml" xmlns:w15="http://schemas.microsoft.com/office/word/2012/wordml" xmlns:w16se="http://schemas.microsoft.com/office/word/2015/wordml/symex" xmlns:wpg="http://schemas.microsoft.com/office/word/2010/wordprocessingGroup" xmlns:wpi="http://schemas.microsoft.com/office/word/2010/wordprocessingInk" xmlns:wne="http://schemas.microsoft.com/office/word/2006/wordml" xmlns:wps="http://schemas.microsoft.com/office/word/2010/wordprocessingShape" mc:Ignorable="w14 w15 w16se wp14">
   <w:background w:color="FFFFFF"/>
   <w:body>
     <w:p>
@@ -18,19 +18,68 @@
       </w:r>
     </w:p>
     <w:p>
-      <w:r>
-        <w:t>06 September 2017</w:t>
-      </w:r>
+      <w:del w:id="1" w:author="Jeroen" w:date="2018-05-17T14:48:00Z">
+        <w:r>
+          <w:delText xml:space="preserve">06 </w:delText>
+        </w:r>
+      </w:del>
+      <w:ins w:id="2" w:author="Jeroen" w:date="2018-05-17T14:48:00Z">
+        <w:r>
+          <w:t>16</w:t>
+        </w:r>
+        <w:r>
+          <w:t xml:space="preserve"> </w:t>
+        </w:r>
+      </w:ins>
+      <w:del w:id="3" w:author="Jeroen" w:date="2018-05-17T14:48:00Z">
+        <w:r>
+          <w:delText xml:space="preserve">September </w:delText>
+        </w:r>
+      </w:del>
+      <w:ins w:id="4" w:author="Jeroen" w:date="2018-05-17T14:48:00Z">
+        <w:r>
+          <w:t xml:space="preserve">May </w:t>
+        </w:r>
+      </w:ins>
+      <w:r>
+        <w:t>201</w:t>
+      </w:r>
+      <w:ins w:id="5" w:author="Jeroen" w:date="2018-05-17T14:48:00Z">
+        <w:r>
+          <w:t>8</w:t>
+        </w:r>
+      </w:ins>
+      <w:del w:id="6" w:author="Jeroen" w:date="2018-05-17T14:48:00Z">
+        <w:r>
+          <w:delText>7</w:delText>
+        </w:r>
+      </w:del>
     </w:p>
     <w:p>
       <w:r>
         <w:t>Ecosampler</w:t>
       </w:r>
       <w:r>
-        <w:t xml:space="preserve"> is a utility for Ecopath with Ecosim </w:t>
-      </w:r>
-      <w:r>
-        <w:t xml:space="preserve">(EwE) </w:t>
+        <w:t xml:space="preserve"> is a utility for Ecopath with </w:t>
+      </w:r>
+      <w:proofErr w:type="spellStart"/>
+      <w:r>
+        <w:t>Ecosim</w:t>
+      </w:r>
+      <w:proofErr w:type="spellEnd"/>
+      <w:r>
+        <w:t xml:space="preserve"> </w:t>
+      </w:r>
+      <w:r>
+        <w:t>(</w:t>
+      </w:r>
+      <w:proofErr w:type="spellStart"/>
+      <w:r>
+        <w:t>EwE</w:t>
+      </w:r>
+      <w:proofErr w:type="spellEnd"/>
+      <w:r>
+        <w:t xml:space="preserve">) </w:t>
       </w:r>
       <w:r>
         <w:t>that records alternate balanced Ecopath parameter sets</w:t>
@@ -63,10 +112,26 @@
         <w:t xml:space="preserve"> </w:t>
       </w:r>
       <w:r>
-        <w:t xml:space="preserve">the EwE core modules </w:t>
-      </w:r>
-      <w:r>
-        <w:t xml:space="preserve">Ecopath, Ecosim and Ecospace, </w:t>
+        <w:t xml:space="preserve">the </w:t>
+      </w:r>
+      <w:proofErr w:type="spellStart"/>
+      <w:r>
+        <w:t>EwE</w:t>
+      </w:r>
+      <w:proofErr w:type="spellEnd"/>
+      <w:r>
+        <w:t xml:space="preserve"> core modules </w:t>
+      </w:r>
+      <w:r>
+        <w:t xml:space="preserve">Ecopath, </w:t>
+      </w:r>
+      <w:proofErr w:type="spellStart"/>
+      <w:r>
+        <w:t>Ecosim</w:t>
+      </w:r>
+      <w:proofErr w:type="spellEnd"/>
+      <w:r>
+        <w:t xml:space="preserve"> and Ecospace, </w:t>
       </w:r>
       <w:r>
         <w:t xml:space="preserve">and </w:t>
@@ -124,7 +189,15 @@
         <w:t xml:space="preserve">is </w:t>
       </w:r>
       <w:r>
-        <w:t>scheduled to be released with EwE version 6.6. Until then,</w:t>
+        <w:t xml:space="preserve">scheduled to be released with </w:t>
+      </w:r>
+      <w:proofErr w:type="spellStart"/>
+      <w:r>
+        <w:t>EwE</w:t>
+      </w:r>
+      <w:proofErr w:type="spellEnd"/>
+      <w:r>
+        <w:t xml:space="preserve"> version 6.6. Until then,</w:t>
       </w:r>
       <w:r>
         <w:t xml:space="preserve"> </w:t>
@@ -136,7 +209,15 @@
         <w:t xml:space="preserve">can be request </w:t>
       </w:r>
       <w:r>
-        <w:t>by contacting the EwE development team at</w:t>
+        <w:t xml:space="preserve">by contacting the </w:t>
+      </w:r>
+      <w:proofErr w:type="spellStart"/>
+      <w:r>
+        <w:t>EwE</w:t>
+      </w:r>
+      <w:proofErr w:type="spellEnd"/>
+      <w:r>
+        <w:t xml:space="preserve"> development team at</w:t>
       </w:r>
       <w:r>
         <w:t xml:space="preserve"> e</w:t>
@@ -145,17 +226,16 @@
         <w:t>wedevteam@gmail.com</w:t>
       </w:r>
     </w:p>
-    <w:bookmarkStart w:id="1" w:name="h.x4tf3lmyemyr" w:colFirst="0" w:colLast="0"/>
-    <w:bookmarkEnd w:id="1"/>
     <w:p>
       <w:pPr>
         <w:pStyle w:val="Heading2"/>
         <w:contextualSpacing w:val="0"/>
       </w:pPr>
+      <w:bookmarkStart w:id="7" w:name="h.x4tf3lmyemyr" w:colFirst="0" w:colLast="0"/>
+      <w:bookmarkEnd w:id="7"/>
       <w:r>
         <w:rPr>
           <w:noProof/>
-          <w:lang w:val="en-US" w:eastAsia="en-US"/>
         </w:rPr>
         <mc:AlternateContent>
           <mc:Choice Requires="wps">
@@ -201,6 +281,7 @@
                                 <w:color w:val="auto"/>
                               </w:rPr>
                             </w:pPr>
+                            <w:bookmarkStart w:id="8" w:name="_Ref514331832"/>
                             <w:r>
                               <w:rPr>
                                 <w:color w:val="auto"/>
@@ -227,6 +308,7 @@
                             </w:r>
                             <w:r>
                               <w:rPr>
+                                <w:noProof/>
                                 <w:color w:val="auto"/>
                               </w:rPr>
                               <w:t>1</w:t>
@@ -237,6 +319,7 @@
                               </w:rPr>
                               <w:fldChar w:fldCharType="end"/>
                             </w:r>
+                            <w:bookmarkEnd w:id="8"/>
                             <w:r>
                               <w:rPr>
                                 <w:color w:val="auto"/>
@@ -286,6 +369,7 @@
                           <w:color w:val="auto"/>
                         </w:rPr>
                       </w:pPr>
+                      <w:bookmarkStart w:id="9" w:name="_Ref514331832"/>
                       <w:r>
                         <w:rPr>
                           <w:color w:val="auto"/>
@@ -312,6 +396,7 @@
                       </w:r>
                       <w:r>
                         <w:rPr>
+                          <w:noProof/>
                           <w:color w:val="auto"/>
                         </w:rPr>
                         <w:t>1</w:t>
@@ -322,6 +407,7 @@
                         </w:rPr>
                         <w:fldChar w:fldCharType="end"/>
                       </w:r>
+                      <w:bookmarkEnd w:id="9"/>
                       <w:r>
                         <w:rPr>
                           <w:color w:val="auto"/>
@@ -352,7 +438,6 @@
       <w:r>
         <w:rPr>
           <w:noProof/>
-          <w:lang w:val="en-US" w:eastAsia="en-US"/>
         </w:rPr>
         <mc:AlternateContent>
           <mc:Choice Requires="wpg">
@@ -754,31 +839,64 @@
       <w:r>
         <w:t xml:space="preserve"> (</w:t>
       </w:r>
-      <w:r>
-        <w:fldChar w:fldCharType="begin"/>
-      </w:r>
-      <w:r>
-        <w:instrText xml:space="preserve"> REF _Ref463352122 \h </w:instrText>
-      </w:r>
+      <w:del w:id="10" w:author="Jeroen" w:date="2018-05-17T14:48:00Z">
+        <w:r>
+          <w:fldChar w:fldCharType="begin"/>
+        </w:r>
+        <w:r>
+          <w:delInstrText xml:space="preserve"> REF _Ref463352122 \h </w:delInstrText>
+        </w:r>
+        <w:r>
+          <w:fldChar w:fldCharType="separate"/>
+        </w:r>
+        <w:r>
+          <w:rPr>
+            <w:color w:val="auto"/>
+          </w:rPr>
+          <w:delText xml:space="preserve">Figure </w:delText>
+        </w:r>
+        <w:r>
+          <w:rPr>
+            <w:noProof/>
+            <w:color w:val="auto"/>
+          </w:rPr>
+          <w:delText>1</w:delText>
+        </w:r>
+        <w:r>
+          <w:fldChar w:fldCharType="end"/>
+        </w:r>
+      </w:del>
+      <w:ins w:id="11" w:author="Jeroen" w:date="2018-05-17T14:48:00Z">
+        <w:r>
+          <w:fldChar w:fldCharType="begin"/>
+        </w:r>
+        <w:r>
+          <w:instrText xml:space="preserve"> REF _Ref514331832 \h </w:instrText>
+        </w:r>
+      </w:ins>
       <w:r>
         <w:fldChar w:fldCharType="separate"/>
       </w:r>
-      <w:r>
-        <w:rPr>
-          <w:color w:val="auto"/>
-        </w:rPr>
-        <w:t xml:space="preserve">Figure </w:t>
-      </w:r>
-      <w:r>
-        <w:rPr>
-          <w:noProof/>
-          <w:color w:val="auto"/>
-        </w:rPr>
-        <w:t>1</w:t>
-      </w:r>
-      <w:r>
-        <w:fldChar w:fldCharType="end"/>
-      </w:r>
+      <w:ins w:id="12" w:author="Jeroen" w:date="2018-05-17T15:00:00Z">
+        <w:r>
+          <w:rPr>
+            <w:color w:val="auto"/>
+          </w:rPr>
+          <w:t xml:space="preserve">Figure </w:t>
+        </w:r>
+        <w:r>
+          <w:rPr>
+            <w:noProof/>
+            <w:color w:val="auto"/>
+          </w:rPr>
+          <w:t>1</w:t>
+        </w:r>
+      </w:ins>
+      <w:ins w:id="13" w:author="Jeroen" w:date="2018-05-17T14:48:00Z">
+        <w:r>
+          <w:fldChar w:fldCharType="end"/>
+        </w:r>
+      </w:ins>
       <w:r>
         <w:t>):</w:t>
       </w:r>
@@ -870,7 +988,15 @@
         <w:t xml:space="preserve"> </w:t>
       </w:r>
       <w:r>
-        <w:t>a sequential number, whether a sample is currently loaded in the EwE user interface</w:t>
+        <w:t xml:space="preserve">a sequential number, whether a sample is currently loaded in the </w:t>
+      </w:r>
+      <w:proofErr w:type="spellStart"/>
+      <w:r>
+        <w:t>EwE</w:t>
+      </w:r>
+      <w:proofErr w:type="spellEnd"/>
+      <w:r>
+        <w:t xml:space="preserve"> user interface</w:t>
       </w:r>
       <w:r>
         <w:t>, and the data and computer system the sample was recorded on</w:t>
@@ -927,7 +1053,15 @@
         <w:t xml:space="preserve">run a </w:t>
       </w:r>
       <w:r>
-        <w:t>number of samples through EwE.</w:t>
+        <w:t xml:space="preserve">number of samples through </w:t>
+      </w:r>
+      <w:proofErr w:type="spellStart"/>
+      <w:r>
+        <w:t>EwE</w:t>
+      </w:r>
+      <w:proofErr w:type="spellEnd"/>
+      <w:r>
+        <w:t>.</w:t>
       </w:r>
       <w:r>
         <w:rPr>
@@ -941,22 +1075,45 @@
         <w:pStyle w:val="Heading2"/>
         <w:contextualSpacing w:val="0"/>
       </w:pPr>
-      <w:bookmarkStart w:id="2" w:name="h.vlq3lgknrsfn" w:colFirst="0" w:colLast="0"/>
-      <w:bookmarkEnd w:id="2"/>
+      <w:bookmarkStart w:id="14" w:name="h.vlq3lgknrsfn" w:colFirst="0" w:colLast="0"/>
+      <w:bookmarkEnd w:id="14"/>
       <w:r>
         <w:t>Recording samples</w:t>
       </w:r>
     </w:p>
     <w:p>
       <w:r>
-        <w:t>Ecosampler records samples from the Monte Carlo routine that ships with the EwE desktop software</w:t>
+        <w:t xml:space="preserve">Ecosampler records samples from the Monte Carlo routine that ships with the </w:t>
+      </w:r>
+      <w:proofErr w:type="spellStart"/>
+      <w:r>
+        <w:t>EwE</w:t>
+      </w:r>
+      <w:proofErr w:type="spellEnd"/>
+      <w:r>
+        <w:t xml:space="preserve"> desktop software</w:t>
       </w:r>
       <w:r>
         <w:t xml:space="preserve">. </w:t>
       </w:r>
       <w:r>
-        <w:t xml:space="preserve"> while Ecosampler </w:t>
-      </w:r>
+        <w:t xml:space="preserve"> </w:t>
+      </w:r>
+      <w:ins w:id="15" w:author="Jeroen" w:date="2018-05-17T14:48:00Z">
+        <w:r>
+          <w:t xml:space="preserve">Toggle the </w:t>
+        </w:r>
+      </w:ins>
+      <w:del w:id="16" w:author="Jeroen" w:date="2018-05-17T14:48:00Z">
+        <w:r>
+          <w:delText xml:space="preserve">while Ecosampler </w:delText>
+        </w:r>
+      </w:del>
+      <w:ins w:id="17" w:author="Jeroen" w:date="2018-05-17T14:48:00Z">
+        <w:r>
+          <w:t>“</w:t>
+        </w:r>
+      </w:ins>
       <w:r>
         <w:t xml:space="preserve">Record” button </w:t>
       </w:r>
@@ -972,24 +1129,49 @@
       <w:r>
         <w:fldChar w:fldCharType="separate"/>
       </w:r>
-      <w:r>
-        <w:rPr>
-          <w:color w:val="auto"/>
-        </w:rPr>
-        <w:t xml:space="preserve">Figure </w:t>
-      </w:r>
-      <w:r>
-        <w:rPr>
-          <w:noProof/>
-          <w:color w:val="auto"/>
-        </w:rPr>
-        <w:t>2</w:t>
-      </w:r>
+      <w:ins w:id="18" w:author="Jeroen" w:date="2018-05-17T15:00:00Z">
+        <w:r>
+          <w:rPr>
+            <w:color w:val="auto"/>
+          </w:rPr>
+          <w:t xml:space="preserve">Figure </w:t>
+        </w:r>
+        <w:r>
+          <w:rPr>
+            <w:noProof/>
+            <w:color w:val="auto"/>
+          </w:rPr>
+          <w:t>2</w:t>
+        </w:r>
+      </w:ins>
+      <w:del w:id="19" w:author="Jeroen" w:date="2018-05-17T14:58:00Z">
+        <w:r>
+          <w:rPr>
+            <w:color w:val="auto"/>
+          </w:rPr>
+          <w:delText xml:space="preserve">Figure </w:delText>
+        </w:r>
+        <w:r>
+          <w:rPr>
+            <w:noProof/>
+            <w:color w:val="auto"/>
+          </w:rPr>
+          <w:delText>2</w:delText>
+        </w:r>
+      </w:del>
       <w:r>
         <w:fldChar w:fldCharType="end"/>
       </w:r>
       <w:r>
-        <w:t>) is used to enable and disable record mode</w:t>
+        <w:t xml:space="preserve">) </w:t>
+      </w:r>
+      <w:del w:id="20" w:author="Jeroen" w:date="2018-05-17T14:48:00Z">
+        <w:r>
+          <w:delText xml:space="preserve">is used </w:delText>
+        </w:r>
+      </w:del>
+      <w:r>
+        <w:t>to enable and disable record mode</w:t>
       </w:r>
       <w:r>
         <w:t xml:space="preserve">. </w:t>
@@ -1009,7 +1191,15 @@
         <w:pStyle w:val="Instructiontext"/>
       </w:pPr>
       <w:r>
-        <w:t xml:space="preserve">Turn recording on in Ecosampler by clicking </w:t>
+        <w:t>Turn recording on in Ecosampler by clicking</w:t>
+      </w:r>
+      <w:ins w:id="21" w:author="Jeroen" w:date="2018-05-17T15:01:00Z">
+        <w:r>
+          <w:t xml:space="preserve"> the inactive</w:t>
+        </w:r>
+      </w:ins>
+      <w:r>
+        <w:t xml:space="preserve"> </w:t>
       </w:r>
       <w:r>
         <w:t>“</w:t>
@@ -1018,7 +1208,6 @@
         <w:rPr>
           <w:noProof/>
           <w:position w:val="-8"/>
-          <w:lang w:val="en-US" w:eastAsia="en-US"/>
         </w:rPr>
         <w:drawing>
           <wp:inline distT="0" distB="0" distL="0" distR="0" wp14:anchorId="10E859F2" wp14:editId="3CCF5DC6">
@@ -1075,7 +1264,23 @@
         <w:t>”</w:t>
       </w:r>
       <w:r>
-        <w:t xml:space="preserve"> until it turns red</w:t>
+        <w:t xml:space="preserve"> </w:t>
+      </w:r>
+      <w:ins w:id="22" w:author="Jeroen" w:date="2018-05-17T15:01:00Z">
+        <w:r>
+          <w:t xml:space="preserve">button </w:t>
+        </w:r>
+      </w:ins>
+      <w:r>
+        <w:t>until it</w:t>
+      </w:r>
+      <w:ins w:id="23" w:author="Jeroen" w:date="2018-05-17T15:01:00Z">
+        <w:r>
+          <w:t>s icon</w:t>
+        </w:r>
+      </w:ins>
+      <w:r>
+        <w:t xml:space="preserve"> turns red</w:t>
       </w:r>
       <w:r>
         <w:t xml:space="preserve"> (</w:t>
@@ -1090,7 +1295,6 @@
         <w:rPr>
           <w:noProof/>
           <w:position w:val="-8"/>
-          <w:lang w:val="en-US" w:eastAsia="en-US"/>
         </w:rPr>
         <w:drawing>
           <wp:inline distT="0" distB="0" distL="0" distR="0">
@@ -1158,12 +1362,23 @@
         <w:t>un the Monte Carlo routine</w:t>
       </w:r>
       <w:r>
-        <w:t xml:space="preserve"> built into EwE. </w:t>
+        <w:t xml:space="preserve"> built into </w:t>
+      </w:r>
+      <w:proofErr w:type="spellStart"/>
+      <w:r>
+        <w:t>EwE</w:t>
+      </w:r>
+      <w:proofErr w:type="spellEnd"/>
+      <w:r>
+        <w:t xml:space="preserve">. </w:t>
       </w:r>
     </w:p>
     <w:p>
       <w:pPr>
         <w:ind w:left="360"/>
+        <w:rPr>
+          <w:ins w:id="24" w:author="Jeroen" w:date="2018-05-17T14:48:00Z"/>
+        </w:rPr>
       </w:pPr>
       <w:r>
         <w:t xml:space="preserve">While recording, </w:t>
@@ -1217,15 +1432,246 @@
         <w:t>,</w:t>
       </w:r>
       <w:r>
-        <w:t xml:space="preserve"> showing the current date and the name of the computer EwE is executed on.</w:t>
-      </w:r>
+        <w:t xml:space="preserve"> showing the current date and the name of the computer </w:t>
+      </w:r>
+      <w:proofErr w:type="spellStart"/>
+      <w:r>
+        <w:t>EwE</w:t>
+      </w:r>
+      <w:proofErr w:type="spellEnd"/>
+      <w:r>
+        <w:t xml:space="preserve"> is executed on.</w:t>
+      </w:r>
+    </w:p>
+    <w:p>
+      <w:pPr>
+        <w:pStyle w:val="Instruction"/>
+        <w:rPr>
+          <w:ins w:id="25" w:author="Jeroen" w:date="2018-05-17T14:49:00Z"/>
+        </w:rPr>
+      </w:pPr>
+      <w:ins w:id="26" w:author="Jeroen" w:date="2018-05-17T14:49:00Z">
+        <w:r>
+          <w:t xml:space="preserve">To </w:t>
+        </w:r>
+        <w:r>
+          <w:t xml:space="preserve">stop </w:t>
+        </w:r>
+        <w:r>
+          <w:t>record</w:t>
+        </w:r>
+        <w:r>
+          <w:t>ing</w:t>
+        </w:r>
+        <w:r>
+          <w:t xml:space="preserve"> samples, do the following:</w:t>
+        </w:r>
+      </w:ins>
+    </w:p>
+    <w:p>
+      <w:pPr>
+        <w:pStyle w:val="ListParagraph"/>
+        <w:numPr>
+          <w:ilvl w:val="0"/>
+          <w:numId w:val="23"/>
+        </w:numPr>
+        <w:ind w:left="709"/>
+        <w:pPrChange w:id="27" w:author="Jeroen" w:date="2018-05-17T14:49:00Z">
+          <w:pPr>
+            <w:ind w:left="360"/>
+          </w:pPr>
+        </w:pPrChange>
+      </w:pPr>
+      <w:ins w:id="28" w:author="Jeroen" w:date="2018-05-17T14:49:00Z">
+        <w:r>
+          <w:t>Turn recording o</w:t>
+        </w:r>
+      </w:ins>
+      <w:ins w:id="29" w:author="Jeroen" w:date="2018-05-17T14:50:00Z">
+        <w:r>
+          <w:t>ff</w:t>
+        </w:r>
+      </w:ins>
+      <w:ins w:id="30" w:author="Jeroen" w:date="2018-05-17T14:49:00Z">
+        <w:r>
+          <w:t xml:space="preserve"> by clicking</w:t>
+        </w:r>
+      </w:ins>
+      <w:ins w:id="31" w:author="Jeroen" w:date="2018-05-17T14:51:00Z">
+        <w:r>
+          <w:t xml:space="preserve"> the active</w:t>
+        </w:r>
+      </w:ins>
+      <w:ins w:id="32" w:author="Jeroen" w:date="2018-05-17T14:49:00Z">
+        <w:r>
+          <w:t xml:space="preserve"> </w:t>
+        </w:r>
+        <w:r>
+          <w:t>“</w:t>
+        </w:r>
+      </w:ins>
+      <w:ins w:id="33" w:author="Jeroen" w:date="2018-05-17T14:51:00Z">
+        <w:r>
+          <w:rPr>
+            <w:noProof/>
+            <w:position w:val="-8"/>
+          </w:rPr>
+          <w:drawing>
+            <wp:inline distT="0" distB="0" distL="0" distR="0" wp14:anchorId="07EE89BD" wp14:editId="6526BF72">
+              <wp:extent cx="203175" cy="203175"/>
+              <wp:effectExtent l="0" t="0" r="6985" b="6985"/>
+              <wp:docPr id="15" name="Picture 15"/>
+              <wp:cNvGraphicFramePr>
+                <a:graphicFrameLocks xmlns:a="http://schemas.openxmlformats.org/drawingml/2006/main" noChangeAspect="1"/>
+              </wp:cNvGraphicFramePr>
+              <a:graphic xmlns:a="http://schemas.openxmlformats.org/drawingml/2006/main">
+                <a:graphicData uri="http://schemas.openxmlformats.org/drawingml/2006/picture">
+                  <pic:pic xmlns:pic="http://schemas.openxmlformats.org/drawingml/2006/picture">
+                    <pic:nvPicPr>
+                      <pic:cNvPr id="3" name="RecordingHS.png"/>
+                      <pic:cNvPicPr/>
+                    </pic:nvPicPr>
+                    <pic:blipFill>
+                      <a:blip r:embed="rId9">
+                        <a:extLst>
+                          <a:ext uri="{28A0092B-C50C-407E-A947-70E740481C1C}">
+                            <a14:useLocalDpi xmlns:a14="http://schemas.microsoft.com/office/drawing/2010/main" val="0"/>
+                          </a:ext>
+                        </a:extLst>
+                      </a:blip>
+                      <a:stretch>
+                        <a:fillRect/>
+                      </a:stretch>
+                    </pic:blipFill>
+                    <pic:spPr>
+                      <a:xfrm>
+                        <a:off x="0" y="0"/>
+                        <a:ext cx="203175" cy="203175"/>
+                      </a:xfrm>
+                      <a:prstGeom prst="rect">
+                        <a:avLst/>
+                      </a:prstGeom>
+                    </pic:spPr>
+                  </pic:pic>
+                </a:graphicData>
+              </a:graphic>
+            </wp:inline>
+          </w:drawing>
+        </w:r>
+      </w:ins>
+      <w:ins w:id="34" w:author="Jeroen" w:date="2018-05-17T14:49:00Z">
+        <w:r>
+          <w:t>Record</w:t>
+        </w:r>
+        <w:r>
+          <w:t>”</w:t>
+        </w:r>
+        <w:r>
+          <w:t xml:space="preserve"> </w:t>
+        </w:r>
+      </w:ins>
+      <w:ins w:id="35" w:author="Jeroen" w:date="2018-05-17T14:51:00Z">
+        <w:r>
+          <w:t xml:space="preserve">button </w:t>
+        </w:r>
+      </w:ins>
+      <w:ins w:id="36" w:author="Jeroen" w:date="2018-05-17T15:01:00Z">
+        <w:r>
+          <w:t>until</w:t>
+        </w:r>
+      </w:ins>
+      <w:ins w:id="37" w:author="Jeroen" w:date="2018-05-17T14:51:00Z">
+        <w:r>
+          <w:t xml:space="preserve"> it</w:t>
+        </w:r>
+      </w:ins>
+      <w:ins w:id="38" w:author="Jeroen" w:date="2018-05-17T15:01:00Z">
+        <w:r>
+          <w:t>s icon</w:t>
+        </w:r>
+      </w:ins>
+      <w:ins w:id="39" w:author="Jeroen" w:date="2018-05-17T14:51:00Z">
+        <w:r>
+          <w:t xml:space="preserve"> turns </w:t>
+        </w:r>
+        <w:bookmarkStart w:id="40" w:name="_GoBack"/>
+        <w:bookmarkEnd w:id="40"/>
+        <w:r>
+          <w:t>black (</w:t>
+        </w:r>
+        <w:r>
+          <w:rPr>
+            <w:noProof/>
+            <w:position w:val="-8"/>
+          </w:rPr>
+          <w:drawing>
+            <wp:inline distT="0" distB="0" distL="0" distR="0" wp14:anchorId="15C51CE7" wp14:editId="45F27A52">
+              <wp:extent cx="203175" cy="203175"/>
+              <wp:effectExtent l="0" t="0" r="6985" b="6985"/>
+              <wp:docPr id="14" name="Picture 14"/>
+              <wp:cNvGraphicFramePr>
+                <a:graphicFrameLocks xmlns:a="http://schemas.openxmlformats.org/drawingml/2006/main" noChangeAspect="1"/>
+              </wp:cNvGraphicFramePr>
+              <a:graphic xmlns:a="http://schemas.openxmlformats.org/drawingml/2006/main">
+                <a:graphicData uri="http://schemas.openxmlformats.org/drawingml/2006/picture">
+                  <pic:pic xmlns:pic="http://schemas.openxmlformats.org/drawingml/2006/picture">
+                    <pic:nvPicPr>
+                      <pic:cNvPr id="2" name="RecordHS.png"/>
+                      <pic:cNvPicPr/>
+                    </pic:nvPicPr>
+                    <pic:blipFill>
+                      <a:blip r:embed="rId8">
+                        <a:extLst>
+                          <a:ext uri="{28A0092B-C50C-407E-A947-70E740481C1C}">
+                            <a14:useLocalDpi xmlns:a14="http://schemas.microsoft.com/office/drawing/2010/main" val="0"/>
+                          </a:ext>
+                        </a:extLst>
+                      </a:blip>
+                      <a:stretch>
+                        <a:fillRect/>
+                      </a:stretch>
+                    </pic:blipFill>
+                    <pic:spPr>
+                      <a:xfrm>
+                        <a:off x="0" y="0"/>
+                        <a:ext cx="203175" cy="203175"/>
+                      </a:xfrm>
+                      <a:prstGeom prst="rect">
+                        <a:avLst/>
+                      </a:prstGeom>
+                    </pic:spPr>
+                  </pic:pic>
+                </a:graphicData>
+              </a:graphic>
+            </wp:inline>
+          </w:drawing>
+        </w:r>
+        <w:r>
+          <w:t xml:space="preserve">), </w:t>
+        </w:r>
+      </w:ins>
+      <w:ins w:id="41" w:author="Jeroen" w:date="2018-05-17T14:49:00Z">
+        <w:r>
+          <w:t xml:space="preserve">indicating that record mode is </w:t>
+        </w:r>
+      </w:ins>
+      <w:ins w:id="42" w:author="Jeroen" w:date="2018-05-17T14:52:00Z">
+        <w:r>
+          <w:t>inactive</w:t>
+        </w:r>
+      </w:ins>
+      <w:ins w:id="43" w:author="Jeroen" w:date="2018-05-17T14:49:00Z">
+        <w:r>
+          <w:t>.</w:t>
+        </w:r>
+      </w:ins>
     </w:p>
     <w:p>
       <w:pPr>
         <w:framePr w:w="3498" w:h="7683" w:hSpace="181" w:wrap="around" w:vAnchor="text" w:hAnchor="page" w:x="6960" w:y="-59"/>
       </w:pPr>
-      <w:bookmarkStart w:id="3" w:name="h.z4v56aogrrkc" w:colFirst="0" w:colLast="0"/>
-      <w:bookmarkEnd w:id="3"/>
+      <w:bookmarkStart w:id="44" w:name="h.z4v56aogrrkc" w:colFirst="0" w:colLast="0"/>
+      <w:bookmarkEnd w:id="44"/>
     </w:p>
     <w:p>
       <w:pPr>
@@ -1235,7 +1681,6 @@
       <w:r>
         <w:rPr>
           <w:noProof/>
-          <w:lang w:val="en-US" w:eastAsia="en-US"/>
         </w:rPr>
         <mc:AlternateContent>
           <mc:Choice Requires="wpg">
@@ -1329,7 +1774,7 @@
                                   <w:color w:val="auto"/>
                                 </w:rPr>
                               </w:pPr>
-                              <w:bookmarkStart w:id="4" w:name="_Ref463294383"/>
+                              <w:bookmarkStart w:id="45" w:name="_Ref463294383"/>
                               <w:r>
                                 <w:rPr>
                                   <w:color w:val="auto"/>
@@ -1368,7 +1813,7 @@
                                 </w:rPr>
                                 <w:fldChar w:fldCharType="end"/>
                               </w:r>
-                              <w:bookmarkEnd w:id="4"/>
+                              <w:bookmarkEnd w:id="45"/>
                               <w:r>
                                 <w:rPr>
                                   <w:color w:val="auto"/>
@@ -1415,7 +1860,21 @@
                                 <w:rPr>
                                   <w:color w:val="auto"/>
                                 </w:rPr>
-                                <w:t xml:space="preserve"> is loaded in EwE, and the sample can be unloaded or deleted</w:t>
+                                <w:t xml:space="preserve"> is loaded in </w:t>
+                              </w:r>
+                              <w:proofErr w:type="spellStart"/>
+                              <w:r>
+                                <w:rPr>
+                                  <w:color w:val="auto"/>
+                                </w:rPr>
+                                <w:t>EwE</w:t>
+                              </w:r>
+                              <w:proofErr w:type="spellEnd"/>
+                              <w:r>
+                                <w:rPr>
+                                  <w:color w:val="auto"/>
+                                </w:rPr>
+                                <w:t>, and the sample can be unloaded or deleted</w:t>
                               </w:r>
                               <w:r>
                                 <w:rPr>
@@ -1462,7 +1921,7 @@
                             <w:color w:val="auto"/>
                           </w:rPr>
                         </w:pPr>
-                        <w:bookmarkStart w:id="5" w:name="_Ref463294383"/>
+                        <w:bookmarkStart w:id="46" w:name="_Ref463294383"/>
                         <w:r>
                           <w:rPr>
                             <w:color w:val="auto"/>
@@ -1501,7 +1960,7 @@
                           </w:rPr>
                           <w:fldChar w:fldCharType="end"/>
                         </w:r>
-                        <w:bookmarkEnd w:id="5"/>
+                        <w:bookmarkEnd w:id="46"/>
                         <w:r>
                           <w:rPr>
                             <w:color w:val="auto"/>
@@ -1548,7 +2007,21 @@
                           <w:rPr>
                             <w:color w:val="auto"/>
                           </w:rPr>
-                          <w:t xml:space="preserve"> is loaded in EwE, and the sample can be unloaded or deleted</w:t>
+                          <w:t xml:space="preserve"> is loaded in </w:t>
+                        </w:r>
+                        <w:proofErr w:type="spellStart"/>
+                        <w:r>
+                          <w:rPr>
+                            <w:color w:val="auto"/>
+                          </w:rPr>
+                          <w:t>EwE</w:t>
+                        </w:r>
+                        <w:proofErr w:type="spellEnd"/>
+                        <w:r>
+                          <w:rPr>
+                            <w:color w:val="auto"/>
+                          </w:rPr>
+                          <w:t>, and the sample can be unloaded or deleted</w:t>
                         </w:r>
                         <w:r>
                           <w:rPr>
@@ -1589,8 +2062,13 @@
       <w:r>
         <w:t xml:space="preserve">to </w:t>
       </w:r>
-      <w:r>
-        <w:t xml:space="preserve">EwE interface </w:t>
+      <w:proofErr w:type="spellStart"/>
+      <w:r>
+        <w:t>EwE</w:t>
+      </w:r>
+      <w:proofErr w:type="spellEnd"/>
+      <w:r>
+        <w:t xml:space="preserve"> interface </w:t>
       </w:r>
       <w:r>
         <w:t xml:space="preserve">to assess its validity. </w:t>
@@ -1790,7 +2268,6 @@
       <w:r>
         <w:rPr>
           <w:noProof/>
-          <w:lang w:val="en-US" w:eastAsia="en-US"/>
         </w:rPr>
         <w:drawing>
           <wp:anchor distT="0" distB="0" distL="114300" distR="114300" simplePos="0" relativeHeight="251656704" behindDoc="1" locked="0" layoutInCell="1" allowOverlap="1">
@@ -1887,6 +2364,7 @@
         <w:t xml:space="preserve">original </w:t>
       </w:r>
       <w:r>
+        <w:lastRenderedPageBreak/>
         <w:t xml:space="preserve">model </w:t>
       </w:r>
       <w:r>
@@ -1949,25 +2427,39 @@
         <w:t>the model under a new name</w:t>
       </w:r>
       <w:r>
-        <w:t>, using the sample content as new Ecopath base line inputs.</w:t>
+        <w:t xml:space="preserve">, using the sample content as new Ecopath base line </w:t>
+      </w:r>
+      <w:proofErr w:type="gramStart"/>
+      <w:r>
+        <w:t>inputs.</w:t>
       </w:r>
       <w:r>
         <w:t>.</w:t>
       </w:r>
+      <w:proofErr w:type="gramEnd"/>
     </w:p>
     <w:p>
       <w:pPr>
         <w:pStyle w:val="Heading2"/>
         <w:contextualSpacing w:val="0"/>
       </w:pPr>
-      <w:bookmarkStart w:id="5" w:name="h.gwwjhcsrmucd" w:colFirst="0" w:colLast="0"/>
-      <w:bookmarkEnd w:id="5"/>
-      <w:r>
-        <w:lastRenderedPageBreak/>
+      <w:bookmarkStart w:id="47" w:name="h.gwwjhcsrmucd" w:colFirst="0" w:colLast="0"/>
+      <w:bookmarkEnd w:id="47"/>
+      <w:r>
         <w:t>Importing samples</w:t>
       </w:r>
     </w:p>
     <w:p>
+      <w:pPr>
+        <w:pStyle w:val="Instructiontext"/>
+        <w:numPr>
+          <w:ilvl w:val="0"/>
+          <w:numId w:val="0"/>
+        </w:numPr>
+        <w:rPr>
+          <w:ins w:id="48" w:author="Jeroen" w:date="2018-05-17T14:53:00Z"/>
+        </w:rPr>
+      </w:pPr>
       <w:r>
         <w:t>Finding a large number of samples may take considerable time, especially when Monte Carlo is configured to perturb</w:t>
       </w:r>
@@ -1975,22 +2467,207 @@
         <w:t xml:space="preserve"> the diet composition matrix. </w:t>
       </w:r>
       <w:r>
-        <w:t xml:space="preserve">In this case it makes sense to run Ecosampler on copies of the same model simultaneously on multiple computers. The Import Samples functionality can then be used to bring all generated samples – generated by the Ecosampler runs in different copies of the EwE model – </w:t>
+        <w:t xml:space="preserve">In this case it makes sense to run Ecosampler on copies of the same model simultaneously on multiple computers. The Import Samples functionality can then be used to bring all generated samples – generated by the Ecosampler runs in different copies of the </w:t>
+      </w:r>
+      <w:proofErr w:type="spellStart"/>
+      <w:r>
+        <w:t>EwE</w:t>
+      </w:r>
+      <w:proofErr w:type="spellEnd"/>
+      <w:r>
+        <w:t xml:space="preserve"> model – </w:t>
       </w:r>
       <w:r>
         <w:t>back into one model.</w:t>
       </w:r>
-      <w:r>
-        <w:t xml:space="preserve"> </w:t>
-      </w:r>
+      <w:ins w:id="49" w:author="Jeroen" w:date="2018-05-17T14:53:00Z">
+        <w:r>
+          <w:t xml:space="preserve"> </w:t>
+        </w:r>
+      </w:ins>
+    </w:p>
+    <w:p>
+      <w:ins w:id="50" w:author="Jeroen" w:date="2018-05-17T14:53:00Z">
+        <w:r>
+          <w:rPr>
+            <w:noProof/>
+          </w:rPr>
+          <w:drawing>
+            <wp:anchor distT="0" distB="0" distL="114300" distR="114300" simplePos="0" relativeHeight="251666944" behindDoc="1" locked="0" layoutInCell="1" allowOverlap="1" wp14:anchorId="2BC90AEB" wp14:editId="5AB49A08">
+              <wp:simplePos x="0" y="0"/>
+              <wp:positionH relativeFrom="column">
+                <wp:posOffset>0</wp:posOffset>
+              </wp:positionH>
+              <wp:positionV relativeFrom="paragraph">
+                <wp:posOffset>3175</wp:posOffset>
+              </wp:positionV>
+              <wp:extent cx="152400" cy="152400"/>
+              <wp:effectExtent l="0" t="0" r="0" b="0"/>
+              <wp:wrapTight wrapText="bothSides">
+                <wp:wrapPolygon edited="0">
+                  <wp:start x="0" y="0"/>
+                  <wp:lineTo x="0" y="18900"/>
+                  <wp:lineTo x="18900" y="18900"/>
+                  <wp:lineTo x="18900" y="0"/>
+                  <wp:lineTo x="0" y="0"/>
+                </wp:wrapPolygon>
+              </wp:wrapTight>
+              <wp:docPr id="16" name="Picture 16"/>
+              <wp:cNvGraphicFramePr>
+                <a:graphicFrameLocks xmlns:a="http://schemas.openxmlformats.org/drawingml/2006/main" noChangeAspect="1"/>
+              </wp:cNvGraphicFramePr>
+              <a:graphic xmlns:a="http://schemas.openxmlformats.org/drawingml/2006/main">
+                <a:graphicData uri="http://schemas.openxmlformats.org/drawingml/2006/picture">
+                  <pic:pic xmlns:pic="http://schemas.openxmlformats.org/drawingml/2006/picture">
+                    <pic:nvPicPr>
+                      <pic:cNvPr id="0" name="Warning.png"/>
+                      <pic:cNvPicPr/>
+                    </pic:nvPicPr>
+                    <pic:blipFill>
+                      <a:blip r:embed="rId12">
+                        <a:extLst>
+                          <a:ext uri="{28A0092B-C50C-407E-A947-70E740481C1C}">
+                            <a14:useLocalDpi xmlns:a14="http://schemas.microsoft.com/office/drawing/2010/main" val="0"/>
+                          </a:ext>
+                        </a:extLst>
+                      </a:blip>
+                      <a:stretch>
+                        <a:fillRect/>
+                      </a:stretch>
+                    </pic:blipFill>
+                    <pic:spPr>
+                      <a:xfrm>
+                        <a:off x="0" y="0"/>
+                        <a:ext cx="152400" cy="152400"/>
+                      </a:xfrm>
+                      <a:prstGeom prst="rect">
+                        <a:avLst/>
+                      </a:prstGeom>
+                    </pic:spPr>
+                  </pic:pic>
+                </a:graphicData>
+              </a:graphic>
+              <wp14:sizeRelH relativeFrom="page">
+                <wp14:pctWidth>0</wp14:pctWidth>
+              </wp14:sizeRelH>
+              <wp14:sizeRelV relativeFrom="page">
+                <wp14:pctHeight>0</wp14:pctHeight>
+              </wp14:sizeRelV>
+            </wp:anchor>
+          </w:drawing>
+        </w:r>
+        <w:r>
+          <w:t xml:space="preserve">Note that </w:t>
+        </w:r>
+        <w:r>
+          <w:t xml:space="preserve">it is </w:t>
+        </w:r>
+      </w:ins>
+      <w:ins w:id="51" w:author="Jeroen" w:date="2018-05-17T14:54:00Z">
+        <w:r>
+          <w:rPr>
+            <w:rPrChange w:id="52" w:author="Jeroen" w:date="2018-05-17T14:54:00Z">
+              <w:rPr/>
+            </w:rPrChange>
+          </w:rPr>
+          <w:t>NOT</w:t>
+        </w:r>
+        <w:r>
+          <w:t xml:space="preserve"> </w:t>
+        </w:r>
+      </w:ins>
+      <w:ins w:id="53" w:author="Jeroen" w:date="2018-05-17T14:53:00Z">
+        <w:r>
+          <w:t xml:space="preserve">recommended to run multiple copies of </w:t>
+        </w:r>
+        <w:r>
+          <w:t xml:space="preserve">Ecosampler </w:t>
+        </w:r>
+        <w:r>
+          <w:t xml:space="preserve">on the same computer and the same </w:t>
+        </w:r>
+        <w:proofErr w:type="spellStart"/>
+        <w:r>
+          <w:t>EwE</w:t>
+        </w:r>
+        <w:proofErr w:type="spellEnd"/>
+        <w:r>
+          <w:t xml:space="preserve"> model. Microsoft Access models are not designed for c</w:t>
+        </w:r>
+      </w:ins>
+      <w:ins w:id="54" w:author="Jeroen" w:date="2018-05-17T14:54:00Z">
+        <w:r>
+          <w:t xml:space="preserve">oncurrent (e.g., use by multiple programs at the same time).  If you wish to run multiple Ecosampler copies on </w:t>
+        </w:r>
+      </w:ins>
+      <w:ins w:id="55" w:author="Jeroen" w:date="2018-05-17T14:55:00Z">
+        <w:r>
+          <w:t xml:space="preserve">one computer, then </w:t>
+        </w:r>
+      </w:ins>
+      <w:ins w:id="56" w:author="Jeroen" w:date="2018-05-17T14:57:00Z">
+        <w:r>
+          <w:t xml:space="preserve">each Ecosampler </w:t>
+        </w:r>
+      </w:ins>
+      <w:ins w:id="57" w:author="Jeroen" w:date="2018-05-17T14:55:00Z">
+        <w:r>
+          <w:t xml:space="preserve">copy </w:t>
+        </w:r>
+      </w:ins>
+      <w:ins w:id="58" w:author="Jeroen" w:date="2018-05-17T14:57:00Z">
+        <w:r>
+          <w:t xml:space="preserve">MUST </w:t>
+        </w:r>
+      </w:ins>
+      <w:ins w:id="59" w:author="Jeroen" w:date="2018-05-17T14:55:00Z">
+        <w:r>
+          <w:t xml:space="preserve">operate on </w:t>
+        </w:r>
+      </w:ins>
+      <w:ins w:id="60" w:author="Jeroen" w:date="2018-05-17T14:57:00Z">
+        <w:r>
+          <w:t xml:space="preserve">its own </w:t>
+        </w:r>
+      </w:ins>
+      <w:ins w:id="61" w:author="Jeroen" w:date="2018-05-17T14:55:00Z">
+        <w:r>
+          <w:t xml:space="preserve">copy of </w:t>
+        </w:r>
+      </w:ins>
+      <w:ins w:id="62" w:author="Jeroen" w:date="2018-05-17T14:57:00Z">
+        <w:r>
+          <w:t xml:space="preserve">the </w:t>
+        </w:r>
+      </w:ins>
+      <w:proofErr w:type="spellStart"/>
+      <w:ins w:id="63" w:author="Jeroen" w:date="2018-05-17T14:55:00Z">
+        <w:r>
+          <w:t>EwE</w:t>
+        </w:r>
+        <w:proofErr w:type="spellEnd"/>
+        <w:r>
+          <w:t xml:space="preserve"> model!</w:t>
+        </w:r>
+      </w:ins>
+      <w:del w:id="64" w:author="Jeroen" w:date="2018-05-17T14:53:00Z">
+        <w:r>
+          <w:delText xml:space="preserve"> </w:delText>
+        </w:r>
+      </w:del>
     </w:p>
     <w:p>
       <w:pPr>
         <w:pStyle w:val="Instruction"/>
       </w:pPr>
       <w:r>
-        <w:t>To import models from another model</w:t>
-      </w:r>
+        <w:t xml:space="preserve">To import models from another </w:t>
+      </w:r>
+      <w:proofErr w:type="gramStart"/>
+      <w:r>
+        <w:t>model</w:t>
+      </w:r>
+      <w:proofErr w:type="gramEnd"/>
       <w:r>
         <w:t xml:space="preserve"> do the following</w:t>
       </w:r>
@@ -2016,7 +2693,6 @@
         <w:rPr>
           <w:noProof/>
           <w:position w:val="-4"/>
-          <w:lang w:val="en-US" w:eastAsia="en-US"/>
         </w:rPr>
         <w:drawing>
           <wp:inline distT="0" distB="0" distL="0" distR="0">
@@ -2140,7 +2816,6 @@
       <w:r>
         <w:rPr>
           <w:noProof/>
-          <w:lang w:val="en-US" w:eastAsia="en-US"/>
         </w:rPr>
         <w:drawing>
           <wp:anchor distT="0" distB="0" distL="114300" distR="114300" simplePos="0" relativeHeight="251657728" behindDoc="1" locked="0" layoutInCell="1" allowOverlap="1">
@@ -2241,7 +2916,6 @@
       <w:r>
         <w:rPr>
           <w:noProof/>
-          <w:lang w:val="en-US" w:eastAsia="en-US"/>
         </w:rPr>
         <w:drawing>
           <wp:anchor distT="0" distB="0" distL="114300" distR="114300" simplePos="0" relativeHeight="251658752" behindDoc="0" locked="0" layoutInCell="1" allowOverlap="1">
@@ -2309,7 +2983,15 @@
         <w:t xml:space="preserve">to </w:t>
       </w:r>
       <w:r>
-        <w:t>import samples generated and stored by the Cefas MSE routines.</w:t>
+        <w:t xml:space="preserve">import samples generated and stored by the </w:t>
+      </w:r>
+      <w:proofErr w:type="spellStart"/>
+      <w:r>
+        <w:t>Cefas</w:t>
+      </w:r>
+      <w:proofErr w:type="spellEnd"/>
+      <w:r>
+        <w:t xml:space="preserve"> MSE routines.</w:t>
       </w:r>
       <w:r>
         <w:t xml:space="preserve"> </w:t>
@@ -2323,8 +3005,8 @@
         <w:pStyle w:val="Heading2"/>
         <w:contextualSpacing w:val="0"/>
       </w:pPr>
-      <w:bookmarkStart w:id="6" w:name="h.udizqrqbvwlm" w:colFirst="0" w:colLast="0"/>
-      <w:bookmarkEnd w:id="6"/>
+      <w:bookmarkStart w:id="65" w:name="h.udizqrqbvwlm" w:colFirst="0" w:colLast="0"/>
+      <w:bookmarkEnd w:id="65"/>
       <w:r>
         <w:t>Expiring samples</w:t>
       </w:r>
@@ -2412,8 +3094,8 @@
           <w:szCs w:val="32"/>
         </w:rPr>
       </w:pPr>
-      <w:bookmarkStart w:id="7" w:name="h.nykknr4r7clg" w:colFirst="0" w:colLast="0"/>
-      <w:bookmarkEnd w:id="7"/>
+      <w:bookmarkStart w:id="66" w:name="h.nykknr4r7clg" w:colFirst="0" w:colLast="0"/>
+      <w:bookmarkEnd w:id="66"/>
       <w:r>
         <w:br w:type="page"/>
       </w:r>
@@ -2430,7 +3112,15 @@
     </w:p>
     <w:p>
       <w:r>
-        <w:t xml:space="preserve">The second aim of Ecosampler is to run a number of samples though various components of EwE and collect output. </w:t>
+        <w:t xml:space="preserve">The second aim of Ecosampler is to run a number of samples though various components of </w:t>
+      </w:r>
+      <w:proofErr w:type="spellStart"/>
+      <w:r>
+        <w:t>EwE</w:t>
+      </w:r>
+      <w:proofErr w:type="spellEnd"/>
+      <w:r>
+        <w:t xml:space="preserve"> and collect output. </w:t>
       </w:r>
     </w:p>
     <w:p>
@@ -2441,7 +3131,15 @@
         <w:t xml:space="preserve">To </w:t>
       </w:r>
       <w:r>
-        <w:t>run Ecosampler samples through EwE, do the following:</w:t>
+        <w:t xml:space="preserve">run Ecosampler samples through </w:t>
+      </w:r>
+      <w:proofErr w:type="spellStart"/>
+      <w:r>
+        <w:t>EwE</w:t>
+      </w:r>
+      <w:proofErr w:type="spellEnd"/>
+      <w:r>
+        <w:t>, do the following:</w:t>
       </w:r>
     </w:p>
     <w:p>
@@ -2456,7 +3154,15 @@
         <w:t xml:space="preserve">Load </w:t>
       </w:r>
       <w:r>
-        <w:t xml:space="preserve">the desired Ecosim and Ecospace scenarios are </w:t>
+        <w:t xml:space="preserve">the desired </w:t>
+      </w:r>
+      <w:proofErr w:type="spellStart"/>
+      <w:r>
+        <w:t>Ecosim</w:t>
+      </w:r>
+      <w:proofErr w:type="spellEnd"/>
+      <w:r>
+        <w:t xml:space="preserve"> and Ecospace scenarios are </w:t>
       </w:r>
       <w:r>
         <w:t xml:space="preserve">correctly </w:t>
@@ -2550,7 +3256,15 @@
         <w:t xml:space="preserve"> will execute the current model configuration as a baseline sample</w:t>
       </w:r>
       <w:r>
-        <w:t>, and will store this in a subfolder “Sample_baseline” under the default core output path. If Ecopath does not balance the user is notified and the batch run is aborted.</w:t>
+        <w:t>, and will store this in a subfolder “</w:t>
+      </w:r>
+      <w:proofErr w:type="spellStart"/>
+      <w:r>
+        <w:t>Sample_baseline</w:t>
+      </w:r>
+      <w:proofErr w:type="spellEnd"/>
+      <w:r>
+        <w:t>” under the default core output path. If Ecopath does not balance the user is notified and the batch run is aborted.</w:t>
       </w:r>
     </w:p>
     <w:p>
@@ -2564,7 +3278,23 @@
         <w:t xml:space="preserve">, then </w:t>
       </w:r>
       <w:r>
-        <w:t xml:space="preserve">Ecosampler checks if Ecosim, Ecospace and Ecotracer are loaded. </w:t>
+        <w:t xml:space="preserve">Ecosampler checks if </w:t>
+      </w:r>
+      <w:proofErr w:type="spellStart"/>
+      <w:r>
+        <w:t>Ecosim</w:t>
+      </w:r>
+      <w:proofErr w:type="spellEnd"/>
+      <w:r>
+        <w:t xml:space="preserve">, Ecospace and </w:t>
+      </w:r>
+      <w:proofErr w:type="spellStart"/>
+      <w:r>
+        <w:t>Ecotracer</w:t>
+      </w:r>
+      <w:proofErr w:type="spellEnd"/>
+      <w:r>
+        <w:t xml:space="preserve"> are loaded. </w:t>
       </w:r>
       <w:r>
         <w:t>Ecosampler</w:t>
@@ -2613,8 +3343,13 @@
       <w:r>
         <w:t xml:space="preserve"> </w:t>
       </w:r>
-      <w:r>
-        <w:t xml:space="preserve">EcoSampler performs the </w:t>
+      <w:proofErr w:type="spellStart"/>
+      <w:r>
+        <w:t>EcoSampler</w:t>
+      </w:r>
+      <w:proofErr w:type="spellEnd"/>
+      <w:r>
+        <w:t xml:space="preserve"> performs the </w:t>
       </w:r>
       <w:r>
         <w:t>following</w:t>
@@ -2653,10 +3388,18 @@
         <w:t xml:space="preserve">a subfolder </w:t>
       </w:r>
       <w:r>
-        <w:t>“Sample_</w:t>
-      </w:r>
-      <w:r>
-        <w:t>[sample number]</w:t>
+        <w:t>“Sample</w:t>
+      </w:r>
+      <w:proofErr w:type="gramStart"/>
+      <w:r>
+        <w:t>_</w:t>
+      </w:r>
+      <w:r>
+        <w:t>[</w:t>
+      </w:r>
+      <w:proofErr w:type="gramEnd"/>
+      <w:r>
+        <w:t>sample number]</w:t>
       </w:r>
       <w:r>
         <w:t>”</w:t>
@@ -2730,8 +3473,13 @@
       <w:r>
         <w:t xml:space="preserve">run </w:t>
       </w:r>
-      <w:r>
-        <w:t xml:space="preserve">Ecosim </w:t>
+      <w:proofErr w:type="spellStart"/>
+      <w:r>
+        <w:t>Ecosim</w:t>
+      </w:r>
+      <w:proofErr w:type="spellEnd"/>
+      <w:r>
+        <w:t xml:space="preserve"> </w:t>
       </w:r>
       <w:r>
         <w:t xml:space="preserve">(if loaded) </w:t>
@@ -2743,7 +3491,15 @@
         <w:t>(if loaded)</w:t>
       </w:r>
       <w:r>
-        <w:t xml:space="preserve"> with Ecotracer enabled (if loaded)</w:t>
+        <w:t xml:space="preserve"> with </w:t>
+      </w:r>
+      <w:proofErr w:type="spellStart"/>
+      <w:r>
+        <w:t>Ecotracer</w:t>
+      </w:r>
+      <w:proofErr w:type="spellEnd"/>
+      <w:r>
+        <w:t xml:space="preserve"> enabled (if loaded)</w:t>
       </w:r>
       <w:r>
         <w:t>.</w:t>
@@ -2756,7 +3512,6 @@
       <w:r>
         <w:rPr>
           <w:noProof/>
-          <w:lang w:val="en-US" w:eastAsia="en-US"/>
         </w:rPr>
         <w:drawing>
           <wp:anchor distT="0" distB="0" distL="114300" distR="114300" simplePos="0" relativeHeight="251660800" behindDoc="0" locked="0" layoutInCell="1" allowOverlap="1" wp14:anchorId="7D1FA7C4" wp14:editId="4274029D">
@@ -2829,8 +3584,13 @@
       <w:r>
         <w:t xml:space="preserve">the present </w:t>
       </w:r>
-      <w:r>
-        <w:t xml:space="preserve">EwE </w:t>
+      <w:proofErr w:type="spellStart"/>
+      <w:r>
+        <w:t>EwE</w:t>
+      </w:r>
+      <w:proofErr w:type="spellEnd"/>
+      <w:r>
+        <w:t xml:space="preserve"> </w:t>
       </w:r>
       <w:r>
         <w:t>configuration</w:t>
@@ -2860,7 +3620,15 @@
         <w:t xml:space="preserve">has no means to </w:t>
       </w:r>
       <w:r>
-        <w:t>control which plug-ins will run. Instead, it relies on the current configuration of the EwE software to take care of this.</w:t>
+        <w:t xml:space="preserve">control which plug-ins will run. Instead, it relies on the current configuration of the </w:t>
+      </w:r>
+      <w:proofErr w:type="spellStart"/>
+      <w:r>
+        <w:t>EwE</w:t>
+      </w:r>
+      <w:proofErr w:type="spellEnd"/>
+      <w:r>
+        <w:t xml:space="preserve"> software to take care of this.</w:t>
       </w:r>
       <w:r>
         <w:t xml:space="preserve"> </w:t>
@@ -2947,8 +3715,13 @@
       <w:r>
         <w:t xml:space="preserve">current </w:t>
       </w:r>
-      <w:r>
-        <w:t>EwE output directory</w:t>
+      <w:proofErr w:type="spellStart"/>
+      <w:r>
+        <w:t>EwE</w:t>
+      </w:r>
+      <w:proofErr w:type="spellEnd"/>
+      <w:r>
+        <w:t xml:space="preserve"> output directory</w:t>
       </w:r>
       <w:r>
         <w:t>, with regular file-based output for the components that were activated.</w:t>
@@ -2957,7 +3730,15 @@
         <w:t xml:space="preserve"> Each sample folder contains the </w:t>
       </w:r>
       <w:r>
-        <w:t xml:space="preserve">various output files written by EwE components set to </w:t>
+        <w:t xml:space="preserve">various output files written by </w:t>
+      </w:r>
+      <w:proofErr w:type="spellStart"/>
+      <w:r>
+        <w:t>EwE</w:t>
+      </w:r>
+      <w:proofErr w:type="spellEnd"/>
+      <w:r>
+        <w:t xml:space="preserve"> components set to </w:t>
       </w:r>
       <w:r>
         <w:t>a</w:t>
@@ -3109,8 +3890,13 @@
       <w:r>
         <w:t xml:space="preserve">Build to logic to import samples generated by the </w:t>
       </w:r>
-      <w:r>
-        <w:t xml:space="preserve">Cefas MSE </w:t>
+      <w:proofErr w:type="spellStart"/>
+      <w:r>
+        <w:t>Cefas</w:t>
+      </w:r>
+      <w:proofErr w:type="spellEnd"/>
+      <w:r>
+        <w:t xml:space="preserve"> MSE </w:t>
       </w:r>
       <w:r>
         <w:t>plug-in.</w:t>
@@ -3128,8 +3914,6 @@
       <w:r>
         <w:t>MS in progress</w:t>
       </w:r>
-      <w:bookmarkStart w:id="8" w:name="_GoBack"/>
-      <w:bookmarkEnd w:id="8"/>
     </w:p>
     <w:p/>
     <w:sectPr>
@@ -3143,7 +3927,7 @@
 </file>
 
 <file path=word/numbering.xml><?xml version="1.0" encoding="utf-8"?>
-<w:numbering xmlns:wpc="http://schemas.microsoft.com/office/word/2010/wordprocessingCanvas" xmlns:cx="http://schemas.microsoft.com/office/drawing/2014/chartex" xmlns:cx1="http://schemas.microsoft.com/office/drawing/2015/9/8/chartex" xmlns:mc="http://schemas.openxmlformats.org/markup-compatibility/2006" xmlns:o="urn:schemas-microsoft-com:office:office" xmlns:r="http://schemas.openxmlformats.org/officeDocument/2006/relationships" xmlns:m="http://schemas.openxmlformats.org/officeDocument/2006/math" xmlns:v="urn:schemas-microsoft-com:vml" xmlns:wp14="http://schemas.microsoft.com/office/word/2010/wordprocessingDrawing" xmlns:wp="http://schemas.openxmlformats.org/drawingml/2006/wordprocessingDrawing" xmlns:w10="urn:schemas-microsoft-com:office:word" xmlns:w="http://schemas.openxmlformats.org/wordprocessingml/2006/main" xmlns:w14="http://schemas.microsoft.com/office/word/2010/wordml" xmlns:w15="http://schemas.microsoft.com/office/word/2012/wordml" xmlns:w16se="http://schemas.microsoft.com/office/word/2015/wordml/symex" xmlns:wpg="http://schemas.microsoft.com/office/word/2010/wordprocessingGroup" xmlns:wpi="http://schemas.microsoft.com/office/word/2010/wordprocessingInk" xmlns:wne="http://schemas.microsoft.com/office/word/2006/wordml" xmlns:wps="http://schemas.microsoft.com/office/word/2010/wordprocessingShape" mc:Ignorable="w14 w15 w16se wp14">
+<w:numbering xmlns:wpc="http://schemas.microsoft.com/office/word/2010/wordprocessingCanvas" xmlns:cx="http://schemas.microsoft.com/office/drawing/2014/chartex" xmlns:mc="http://schemas.openxmlformats.org/markup-compatibility/2006" xmlns:o="urn:schemas-microsoft-com:office:office" xmlns:r="http://schemas.openxmlformats.org/officeDocument/2006/relationships" xmlns:m="http://schemas.openxmlformats.org/officeDocument/2006/math" xmlns:v="urn:schemas-microsoft-com:vml" xmlns:wp14="http://schemas.microsoft.com/office/word/2010/wordprocessingDrawing" xmlns:wp="http://schemas.openxmlformats.org/drawingml/2006/wordprocessingDrawing" xmlns:w10="urn:schemas-microsoft-com:office:word" xmlns:w="http://schemas.openxmlformats.org/wordprocessingml/2006/main" xmlns:w14="http://schemas.microsoft.com/office/word/2010/wordml" xmlns:w15="http://schemas.microsoft.com/office/word/2012/wordml" xmlns:w16se="http://schemas.microsoft.com/office/word/2015/wordml/symex" xmlns:wpg="http://schemas.microsoft.com/office/word/2010/wordprocessingGroup" xmlns:wpi="http://schemas.microsoft.com/office/word/2010/wordprocessingInk" xmlns:wne="http://schemas.microsoft.com/office/word/2006/wordml" xmlns:wps="http://schemas.microsoft.com/office/word/2010/wordprocessingShape" mc:Ignorable="w14 w15 w16se wp14">
   <w:numPicBullet w:numPicBulletId="0">
     <w:pict>
       <v:shapetype id="_x0000_t75" coordsize="21600,21600" o:spt="75" o:preferrelative="t" path="m@4@5l@4@11@9@11@9@5xe" filled="f" stroked="f">
@@ -3165,7 +3949,7 @@
         <v:path o:extrusionok="f" gradientshapeok="t" o:connecttype="rect"/>
         <o:lock v:ext="edit" aspectratio="t"/>
       </v:shapetype>
-      <v:shape id="_x0000_i1029" type="#_x0000_t75" style="width:12pt;height:12pt" o:bullet="t">
+      <v:shape id="_x0000_i1050" type="#_x0000_t75" style="width:12pt;height:12pt" o:bullet="t">
         <v:imagedata r:id="rId1" o:title="Info"/>
       </v:shape>
     </w:pict>
@@ -3437,6 +4221,97 @@
     </w:lvl>
   </w:abstractNum>
   <w:abstractNum w:abstractNumId="3" w15:restartNumberingAfterBreak="0">
+    <w:nsid w:val="11F94142"/>
+    <w:multiLevelType w:val="hybridMultilevel"/>
+    <w:tmpl w:val="6BA880CE"/>
+    <w:lvl w:ilvl="0" w:tplc="E61434C2">
+      <w:start w:val="1"/>
+      <w:numFmt w:val="decimal"/>
+      <w:lvlText w:val="%1."/>
+      <w:lvlJc w:val="left"/>
+      <w:pPr>
+        <w:ind w:left="644" w:hanging="360"/>
+      </w:pPr>
+      <w:rPr>
+        <w:b/>
+        <w:sz w:val="24"/>
+        <w:szCs w:val="24"/>
+      </w:rPr>
+    </w:lvl>
+    <w:lvl w:ilvl="1" w:tplc="08090019" w:tentative="1">
+      <w:start w:val="1"/>
+      <w:numFmt w:val="lowerLetter"/>
+      <w:lvlText w:val="%2."/>
+      <w:lvlJc w:val="left"/>
+      <w:pPr>
+        <w:ind w:left="1364" w:hanging="360"/>
+      </w:pPr>
+    </w:lvl>
+    <w:lvl w:ilvl="2" w:tplc="0809001B" w:tentative="1">
+      <w:start w:val="1"/>
+      <w:numFmt w:val="lowerRoman"/>
+      <w:lvlText w:val="%3."/>
+      <w:lvlJc w:val="right"/>
+      <w:pPr>
+        <w:ind w:left="2084" w:hanging="180"/>
+      </w:pPr>
+    </w:lvl>
+    <w:lvl w:ilvl="3" w:tplc="0809000F" w:tentative="1">
+      <w:start w:val="1"/>
+      <w:numFmt w:val="decimal"/>
+      <w:lvlText w:val="%4."/>
+      <w:lvlJc w:val="left"/>
+      <w:pPr>
+        <w:ind w:left="2804" w:hanging="360"/>
+      </w:pPr>
+    </w:lvl>
+    <w:lvl w:ilvl="4" w:tplc="08090019" w:tentative="1">
+      <w:start w:val="1"/>
+      <w:numFmt w:val="lowerLetter"/>
+      <w:lvlText w:val="%5."/>
+      <w:lvlJc w:val="left"/>
+      <w:pPr>
+        <w:ind w:left="3524" w:hanging="360"/>
+      </w:pPr>
+    </w:lvl>
+    <w:lvl w:ilvl="5" w:tplc="0809001B" w:tentative="1">
+      <w:start w:val="1"/>
+      <w:numFmt w:val="lowerRoman"/>
+      <w:lvlText w:val="%6."/>
+      <w:lvlJc w:val="right"/>
+      <w:pPr>
+        <w:ind w:left="4244" w:hanging="180"/>
+      </w:pPr>
+    </w:lvl>
+    <w:lvl w:ilvl="6" w:tplc="0809000F" w:tentative="1">
+      <w:start w:val="1"/>
+      <w:numFmt w:val="decimal"/>
+      <w:lvlText w:val="%7."/>
+      <w:lvlJc w:val="left"/>
+      <w:pPr>
+        <w:ind w:left="4964" w:hanging="360"/>
+      </w:pPr>
+    </w:lvl>
+    <w:lvl w:ilvl="7" w:tplc="08090019" w:tentative="1">
+      <w:start w:val="1"/>
+      <w:numFmt w:val="lowerLetter"/>
+      <w:lvlText w:val="%8."/>
+      <w:lvlJc w:val="left"/>
+      <w:pPr>
+        <w:ind w:left="5684" w:hanging="360"/>
+      </w:pPr>
+    </w:lvl>
+    <w:lvl w:ilvl="8" w:tplc="0809001B" w:tentative="1">
+      <w:start w:val="1"/>
+      <w:numFmt w:val="lowerRoman"/>
+      <w:lvlText w:val="%9."/>
+      <w:lvlJc w:val="right"/>
+      <w:pPr>
+        <w:ind w:left="6404" w:hanging="180"/>
+      </w:pPr>
+    </w:lvl>
+  </w:abstractNum>
+  <w:abstractNum w:abstractNumId="4" w15:restartNumberingAfterBreak="0">
     <w:nsid w:val="1C006246"/>
     <w:multiLevelType w:val="hybridMultilevel"/>
     <w:tmpl w:val="5A423280"/>
@@ -3531,7 +4406,7 @@
       </w:pPr>
     </w:lvl>
   </w:abstractNum>
-  <w:abstractNum w:abstractNumId="4" w15:restartNumberingAfterBreak="0">
+  <w:abstractNum w:abstractNumId="5" w15:restartNumberingAfterBreak="0">
     <w:nsid w:val="26A25D33"/>
     <w:multiLevelType w:val="hybridMultilevel"/>
     <w:tmpl w:val="7462605C"/>
@@ -3623,7 +4498,7 @@
       </w:pPr>
     </w:lvl>
   </w:abstractNum>
-  <w:abstractNum w:abstractNumId="5" w15:restartNumberingAfterBreak="0">
+  <w:abstractNum w:abstractNumId="6" w15:restartNumberingAfterBreak="0">
     <w:nsid w:val="383F0732"/>
     <w:multiLevelType w:val="hybridMultilevel"/>
     <w:tmpl w:val="52BA399E"/>
@@ -3736,7 +4611,7 @@
       </w:rPr>
     </w:lvl>
   </w:abstractNum>
-  <w:abstractNum w:abstractNumId="6" w15:restartNumberingAfterBreak="0">
+  <w:abstractNum w:abstractNumId="7" w15:restartNumberingAfterBreak="0">
     <w:nsid w:val="39FC252D"/>
     <w:multiLevelType w:val="hybridMultilevel"/>
     <w:tmpl w:val="D0C6C166"/>
@@ -3822,7 +4697,7 @@
       </w:pPr>
     </w:lvl>
   </w:abstractNum>
-  <w:abstractNum w:abstractNumId="7" w15:restartNumberingAfterBreak="0">
+  <w:abstractNum w:abstractNumId="8" w15:restartNumberingAfterBreak="0">
     <w:nsid w:val="5520007F"/>
     <w:multiLevelType w:val="hybridMultilevel"/>
     <w:tmpl w:val="53322E88"/>
@@ -3914,7 +4789,7 @@
       </w:pPr>
     </w:lvl>
   </w:abstractNum>
-  <w:abstractNum w:abstractNumId="8" w15:restartNumberingAfterBreak="0">
+  <w:abstractNum w:abstractNumId="9" w15:restartNumberingAfterBreak="0">
     <w:nsid w:val="5CDC29C1"/>
     <w:multiLevelType w:val="hybridMultilevel"/>
     <w:tmpl w:val="28CA5438"/>
@@ -4008,7 +4883,7 @@
       </w:pPr>
     </w:lvl>
   </w:abstractNum>
-  <w:abstractNum w:abstractNumId="9" w15:restartNumberingAfterBreak="0">
+  <w:abstractNum w:abstractNumId="10" w15:restartNumberingAfterBreak="0">
     <w:nsid w:val="62BB6C5E"/>
     <w:multiLevelType w:val="hybridMultilevel"/>
     <w:tmpl w:val="28CA5438"/>
@@ -4102,7 +4977,7 @@
       </w:pPr>
     </w:lvl>
   </w:abstractNum>
-  <w:abstractNum w:abstractNumId="10" w15:restartNumberingAfterBreak="0">
+  <w:abstractNum w:abstractNumId="11" w15:restartNumberingAfterBreak="0">
     <w:nsid w:val="63FB6699"/>
     <w:multiLevelType w:val="hybridMultilevel"/>
     <w:tmpl w:val="AA2A7E8C"/>
@@ -4215,7 +5090,7 @@
       </w:rPr>
     </w:lvl>
   </w:abstractNum>
-  <w:abstractNum w:abstractNumId="11" w15:restartNumberingAfterBreak="0">
+  <w:abstractNum w:abstractNumId="12" w15:restartNumberingAfterBreak="0">
     <w:nsid w:val="68C776D3"/>
     <w:multiLevelType w:val="hybridMultilevel"/>
     <w:tmpl w:val="ABF8C82A"/>
@@ -4307,7 +5182,7 @@
       </w:pPr>
     </w:lvl>
   </w:abstractNum>
-  <w:abstractNum w:abstractNumId="12" w15:restartNumberingAfterBreak="0">
+  <w:abstractNum w:abstractNumId="13" w15:restartNumberingAfterBreak="0">
     <w:nsid w:val="70A06E9B"/>
     <w:multiLevelType w:val="hybridMultilevel"/>
     <w:tmpl w:val="E67002CA"/>
@@ -4420,7 +5295,7 @@
       </w:rPr>
     </w:lvl>
   </w:abstractNum>
-  <w:abstractNum w:abstractNumId="13" w15:restartNumberingAfterBreak="0">
+  <w:abstractNum w:abstractNumId="14" w15:restartNumberingAfterBreak="0">
     <w:nsid w:val="77280BF6"/>
     <w:multiLevelType w:val="hybridMultilevel"/>
     <w:tmpl w:val="76EA6292"/>
@@ -4514,7 +5389,7 @@
       </w:pPr>
     </w:lvl>
   </w:abstractNum>
-  <w:abstractNum w:abstractNumId="14" w15:restartNumberingAfterBreak="0">
+  <w:abstractNum w:abstractNumId="15" w15:restartNumberingAfterBreak="0">
     <w:nsid w:val="7B913B23"/>
     <w:multiLevelType w:val="hybridMultilevel"/>
     <w:tmpl w:val="8F12156E"/>
@@ -4633,25 +5508,25 @@
     <w:abstractNumId w:val="0"/>
   </w:num>
   <w:num w:numId="2">
-    <w:abstractNumId w:val="5"/>
+    <w:abstractNumId w:val="6"/>
   </w:num>
   <w:num w:numId="3">
-    <w:abstractNumId w:val="12"/>
+    <w:abstractNumId w:val="13"/>
   </w:num>
   <w:num w:numId="4">
-    <w:abstractNumId w:val="10"/>
+    <w:abstractNumId w:val="11"/>
   </w:num>
   <w:num w:numId="5">
-    <w:abstractNumId w:val="6"/>
+    <w:abstractNumId w:val="7"/>
   </w:num>
   <w:num w:numId="6">
-    <w:abstractNumId w:val="8"/>
+    <w:abstractNumId w:val="9"/>
   </w:num>
   <w:num w:numId="7">
-    <w:abstractNumId w:val="13"/>
+    <w:abstractNumId w:val="14"/>
   </w:num>
   <w:num w:numId="8">
-    <w:abstractNumId w:val="9"/>
+    <w:abstractNumId w:val="10"/>
   </w:num>
   <w:num w:numId="9">
     <w:abstractNumId w:val="2"/>
@@ -4660,60 +5535,71 @@
     <w:abstractNumId w:val="1"/>
   </w:num>
   <w:num w:numId="11">
-    <w:abstractNumId w:val="7"/>
+    <w:abstractNumId w:val="8"/>
   </w:num>
   <w:num w:numId="12">
+    <w:abstractNumId w:val="5"/>
+  </w:num>
+  <w:num w:numId="13">
+    <w:abstractNumId w:val="12"/>
+  </w:num>
+  <w:num w:numId="14">
     <w:abstractNumId w:val="4"/>
   </w:num>
-  <w:num w:numId="13">
-    <w:abstractNumId w:val="11"/>
-  </w:num>
-  <w:num w:numId="14">
-    <w:abstractNumId w:val="3"/>
-  </w:num>
   <w:num w:numId="15">
-    <w:abstractNumId w:val="14"/>
+    <w:abstractNumId w:val="15"/>
   </w:num>
   <w:num w:numId="16">
-    <w:abstractNumId w:val="3"/>
+    <w:abstractNumId w:val="4"/>
     <w:lvlOverride w:ilvl="0">
       <w:startOverride w:val="1"/>
     </w:lvlOverride>
   </w:num>
   <w:num w:numId="17">
-    <w:abstractNumId w:val="3"/>
+    <w:abstractNumId w:val="4"/>
     <w:lvlOverride w:ilvl="0">
       <w:startOverride w:val="1"/>
     </w:lvlOverride>
   </w:num>
   <w:num w:numId="18">
-    <w:abstractNumId w:val="3"/>
+    <w:abstractNumId w:val="4"/>
     <w:lvlOverride w:ilvl="0">
       <w:startOverride w:val="1"/>
     </w:lvlOverride>
   </w:num>
   <w:num w:numId="19">
-    <w:abstractNumId w:val="3"/>
+    <w:abstractNumId w:val="4"/>
   </w:num>
   <w:num w:numId="20">
-    <w:abstractNumId w:val="3"/>
+    <w:abstractNumId w:val="4"/>
     <w:lvlOverride w:ilvl="0">
       <w:startOverride w:val="1"/>
     </w:lvlOverride>
   </w:num>
   <w:num w:numId="21">
-    <w:abstractNumId w:val="3"/>
+    <w:abstractNumId w:val="4"/>
     <w:lvlOverride w:ilvl="0">
       <w:startOverride w:val="1"/>
     </w:lvlOverride>
   </w:num>
   <w:num w:numId="22">
-    <w:abstractNumId w:val="3"/>
+    <w:abstractNumId w:val="4"/>
     <w:lvlOverride w:ilvl="0">
       <w:startOverride w:val="1"/>
     </w:lvlOverride>
   </w:num>
+  <w:num w:numId="23">
+    <w:abstractNumId w:val="3"/>
+  </w:num>
 </w:numbering>
+</file>
+
+<file path=word/people.xml><?xml version="1.0" encoding="utf-8"?>
+<w15:people xmlns:wpc="http://schemas.microsoft.com/office/word/2010/wordprocessingCanvas" xmlns:cx="http://schemas.microsoft.com/office/drawing/2014/chartex" xmlns:mc="http://schemas.openxmlformats.org/markup-compatibility/2006" xmlns:o="urn:schemas-microsoft-com:office:office" xmlns:r="http://schemas.openxmlformats.org/officeDocument/2006/relationships" xmlns:m="http://schemas.openxmlformats.org/officeDocument/2006/math" xmlns:v="urn:schemas-microsoft-com:vml" xmlns:wp14="http://schemas.microsoft.com/office/word/2010/wordprocessingDrawing" xmlns:wp="http://schemas.openxmlformats.org/drawingml/2006/wordprocessingDrawing" xmlns:w10="urn:schemas-microsoft-com:office:word" xmlns:w="http://schemas.openxmlformats.org/wordprocessingml/2006/main" xmlns:w14="http://schemas.microsoft.com/office/word/2010/wordml" xmlns:w15="http://schemas.microsoft.com/office/word/2012/wordml" xmlns:w16se="http://schemas.microsoft.com/office/word/2015/wordml/symex" xmlns:wpg="http://schemas.microsoft.com/office/word/2010/wordprocessingGroup" xmlns:wpi="http://schemas.microsoft.com/office/word/2010/wordprocessingInk" xmlns:wne="http://schemas.microsoft.com/office/word/2006/wordml" xmlns:wps="http://schemas.microsoft.com/office/word/2010/wordprocessingShape" mc:Ignorable="w14 w15 w16se wp14">
+  <w15:person w15:author="Jeroen">
+    <w15:presenceInfo w15:providerId="None" w15:userId="Jeroen"/>
+  </w15:person>
+</w15:people>
 </file>
 
 <file path=word/styles.xml><?xml version="1.0" encoding="utf-8"?>
@@ -5646,7 +6532,7 @@
 </file>
 
 <file path=customXml/itemProps1.xml><?xml version="1.0" encoding="utf-8"?>
-<ds:datastoreItem xmlns:ds="http://schemas.openxmlformats.org/officeDocument/2006/customXml" ds:itemID="{4DA183FD-729A-4A81-BBFB-7172D7DD4980}">
+<ds:datastoreItem xmlns:ds="http://schemas.openxmlformats.org/officeDocument/2006/customXml" ds:itemID="{357CC7D3-CD0A-4170-81F7-79B1FC3233D8}">
   <ds:schemaRefs>
     <ds:schemaRef ds:uri="http://schemas.openxmlformats.org/officeDocument/2006/bibliography"/>
   </ds:schemaRefs>

</xml_diff>